<commit_message>
Contrato de mutuo: entrega 27-ago-2026 por consignacion, vence 27-nov-2026, intereses al vencimiento, prepago sin sancion
Co-Authored-By: Claude Opus 4.8 <noreply@anthropic.com>
Claude-Session: https://claude.ai/code/session_01V3nTS2cxs4zGL1pJrFeNth
</commit_message>
<xml_diff>
--- a/prestamos/contrato-mutuo-margarita-a-nicolas.docx
+++ b/prestamos/contrato-mutuo-margarita-a-nicolas.docx
@@ -201,49 +201,46 @@
         <w:t>SEGUNDA. ENTREGA Y RECIBO.</w:t>
       </w:r>
       <w:r>
-        <w:t xml:space="preserve"> La suma se entrega mediante **[transferencia</w:t>
+        <w:t xml:space="preserve"> La suma se entrega mediante **consignación /</w:t>
       </w:r>
     </w:p>
     <w:p>
       <w:r>
-        <w:t>electrónica / cheque / efectivo]</w:t>
+        <w:t>transferencia electrónica</w:t>
       </w:r>
       <w:r>
         <w:rPr>
           <w:b/>
         </w:rPr>
-        <w:t xml:space="preserve"> a </w:t>
+        <w:t xml:space="preserve"> a la cuenta </w:t>
       </w:r>
       <w:r>
-        <w:t>[cuenta / forma]</w:t>
+        <w:t>[__________]** de EL MUTUARIO, el día</w:t>
+      </w:r>
+    </w:p>
+    <w:p>
+      <w:r>
+        <w:rPr>
+          <w:b/>
+        </w:rPr>
+        <w:t>27 de agosto de 2026</w:t>
+      </w:r>
+      <w:r>
+        <w:t xml:space="preserve">. EL MUTUARIO </w:t>
       </w:r>
       <w:r>
         <w:rPr>
           <w:b/>
         </w:rPr>
-        <w:t xml:space="preserve">, el día </w:t>
+        <w:t>declara haber recibido</w:t>
       </w:r>
       <w:r>
-        <w:t>[__] de [____]</w:t>
+        <w:t xml:space="preserve"> dicha suma a entera</w:t>
       </w:r>
     </w:p>
     <w:p>
       <w:r>
-        <w:t>de 2026</w:t>
-      </w:r>
-      <w:r>
-        <w:rPr>
-          <w:b/>
-        </w:rPr>
-        <w:t xml:space="preserve">. EL MUTUARIO </w:t>
-      </w:r>
-      <w:r>
-        <w:t>declara haber recibido** dicha suma a entera satisfacción,</w:t>
-      </w:r>
-    </w:p>
-    <w:p>
-      <w:r>
-        <w:t>prestando este documento mérito de recibo.</w:t>
+        <w:t>satisfacción, prestando este documento mérito de recibo.</w:t>
       </w:r>
     </w:p>
     <w:p>
@@ -290,15 +287,15 @@
         <w:rPr>
           <w:b/>
         </w:rPr>
-        <w:t>[en un solo contado junto con el capital al vencimiento / mensualmente]</w:t>
+        <w:t>en un solo contado, junto con el capital, al vencimiento</w:t>
       </w:r>
       <w:r>
-        <w:t>.</w:t>
+        <w:t>. Las partes</w:t>
       </w:r>
     </w:p>
     <w:p>
       <w:r>
-        <w:t xml:space="preserve">Las partes dejan constancia de que esta tasa </w:t>
+        <w:t xml:space="preserve">dejan constancia de que esta tasa </w:t>
       </w:r>
       <w:r>
         <w:rPr>
@@ -338,7 +335,7 @@
         <w:rPr>
           <w:b/>
         </w:rPr>
-        <w:t>[__] de [____] de 2026</w:t>
+        <w:t>27 de noviembre de 2026</w:t>
       </w:r>
       <w:r>
         <w:t>, fecha en la cual EL</w:t>
@@ -366,21 +363,23 @@
         <w:t>QUINTA. FORMA Y LUGAR DE PAGO.</w:t>
       </w:r>
       <w:r>
-        <w:t xml:space="preserve"> El pago se hará mediante **[transferencia a la</w:t>
+        <w:t xml:space="preserve"> El pago se hará mediante **consignación /</w:t>
       </w:r>
     </w:p>
     <w:p>
       <w:r>
-        <w:t>cuenta [__] de LA MUTUANTE / cheque / efectivo]</w:t>
+        <w:t>transferencia a la cuenta [__________] de LA MUTUANTE**, en el municipio de</w:t>
       </w:r>
+    </w:p>
+    <w:p>
       <w:r>
         <w:rPr>
           <w:b/>
         </w:rPr>
-        <w:t xml:space="preserve">, en el municipio de </w:t>
+        <w:t>[ciudad]</w:t>
       </w:r>
       <w:r>
-        <w:t>[ciudad]**.</w:t>
+        <w:t>.</w:t>
       </w:r>
     </w:p>
     <w:p>
@@ -587,12 +586,12 @@
         <w:t>[ciudad]</w:t>
       </w:r>
       <w:r>
-        <w:t>, a los **[__] días del mes de</w:t>
+        <w:t>, a los **27 días del mes de agosto</w:t>
       </w:r>
     </w:p>
     <w:p>
       <w:r>
-        <w:t>[____] de 2026**, en dos (2) ejemplares.</w:t>
+        <w:t>de 2026**, en dos (2) ejemplares.</w:t>
       </w:r>
     </w:p>
     <w:p>

</xml_diff>

<commit_message>
Contrato de mutuo: cedulas, cuenta de entrega (54984286701) y de pago (10852495293 o efectivo)
Co-Authored-By: Claude Opus 4.8 <noreply@anthropic.com>
Claude-Session: https://claude.ai/code/session_01V3nTS2cxs4zGL1pJrFeNth
</commit_message>
<xml_diff>
--- a/prestamos/contrato-mutuo-margarita-a-nicolas.docx
+++ b/prestamos/contrato-mutuo-margarita-a-nicolas.docx
@@ -109,7 +109,7 @@
         <w:rPr>
           <w:b/>
         </w:rPr>
-        <w:t>[__________]</w:t>
+        <w:t>24.361.601</w:t>
       </w:r>
       <w:r>
         <w:t>, quien para efectos de este contrato se denominará **LA</w:t>
@@ -215,7 +215,7 @@
         <w:t xml:space="preserve"> a la cuenta </w:t>
       </w:r>
       <w:r>
-        <w:t>[__________]** de EL MUTUARIO, el día</w:t>
+        <w:t>No. 54984286701** de EL MUTUARIO, el día</w:t>
       </w:r>
     </w:p>
     <w:p>
@@ -363,15 +363,18 @@
         <w:t>QUINTA. FORMA Y LUGAR DE PAGO.</w:t>
       </w:r>
       <w:r>
-        <w:t xml:space="preserve"> El pago se hará mediante **consignación /</w:t>
+        <w:t xml:space="preserve"> El pago se hará **en efectivo o mediante</w:t>
       </w:r>
     </w:p>
     <w:p>
       <w:r>
-        <w:t>transferencia a la cuenta [__________] de LA MUTUANTE**, en el municipio de</w:t>
+        <w:t>consignación / transferencia a la cuenta No. 10852495293 de LA MUTUANTE**, en el</w:t>
       </w:r>
     </w:p>
     <w:p>
+      <w:r>
+        <w:t xml:space="preserve">municipio de </w:t>
+      </w:r>
       <w:r>
         <w:rPr>
           <w:b/>
@@ -611,7 +614,7 @@
     </w:p>
     <w:p>
       <w:r>
-        <w:t>C.C. No. [__________]                        C.C. No. 1.028.031.225</w:t>
+        <w:t>C.C. No. 24.361.601                          C.C. No. 1.028.031.225</w:t>
       </w:r>
     </w:p>
     <w:sectPr>

</xml_diff>

<commit_message>
Contrato de mutuo: ciudad Medellin; documento completo listo para firmar
Co-Authored-By: Claude Opus 4.8 <noreply@anthropic.com>
Claude-Session: https://claude.ai/code/session_01V3nTS2cxs4zGL1pJrFeNth
</commit_message>
<xml_diff>
--- a/prestamos/contrato-mutuo-margarita-a-nicolas.docx
+++ b/prestamos/contrato-mutuo-margarita-a-nicolas.docx
@@ -98,7 +98,7 @@
         <w:rPr>
           <w:b/>
         </w:rPr>
-        <w:t>[ciudad]</w:t>
+        <w:t>Medellín</w:t>
       </w:r>
       <w:r>
         <w:t>, identificada con la cédula de ciudadanía número</w:t>
@@ -379,7 +379,7 @@
         <w:rPr>
           <w:b/>
         </w:rPr>
-        <w:t>[ciudad]</w:t>
+        <w:t>Medellín</w:t>
       </w:r>
       <w:r>
         <w:t>.</w:t>
@@ -586,7 +586,7 @@
         <w:rPr>
           <w:b/>
         </w:rPr>
-        <w:t>[ciudad]</w:t>
+        <w:t>Medellín</w:t>
       </w:r>
       <w:r>
         <w:t>, a los **27 días del mes de agosto</w:t>

</xml_diff>